<commit_message>
Github Readme: Updated Readme
</commit_message>
<xml_diff>
--- a/docs/Introduction-JetStock-Capstone.docs.docx
+++ b/docs/Introduction-JetStock-Capstone.docs.docx
@@ -27,14 +27,12 @@
       </w:pPr>
       <w:bookmarkStart w:id="0" w:name="_heading=h.gjdgxs" w:colFirst="0" w:colLast="0"/>
       <w:bookmarkEnd w:id="0"/>
-      <w:proofErr w:type="spellStart"/>
       <w:r>
         <w:rPr>
           <w:b/>
         </w:rPr>
         <w:t>JetStock</w:t>
       </w:r>
-      <w:proofErr w:type="spellEnd"/>
     </w:p>
     <w:p>
       <w:pPr>
@@ -71,13 +69,8 @@
       </w:r>
     </w:p>
     <w:p>
-      <w:proofErr w:type="spellStart"/>
-      <w:r>
-        <w:t>JetStock</w:t>
-      </w:r>
-      <w:proofErr w:type="spellEnd"/>
-      <w:r>
-        <w:t xml:space="preserve"> is a web application designed to help small businesses manage their products and inventory in one place. It will allow users to add products, organise them into categories, update stock quantities, identify low-stock items, and search inventory quickly.</w:t>
+      <w:r>
+        <w:t>JetStock is a web application designed to help small businesses manage their products and inventory in one place. It will allow users to add products, organise them into categories, update stock quantities, identify low-stock items, and search inventory quickly.</w:t>
       </w:r>
     </w:p>
     <w:p>
@@ -300,15 +293,7 @@
     </w:p>
     <w:p>
       <w:r>
-        <w:t xml:space="preserve">With </w:t>
-      </w:r>
-      <w:proofErr w:type="spellStart"/>
-      <w:r>
-        <w:t>JetStock</w:t>
-      </w:r>
-      <w:proofErr w:type="spellEnd"/>
-      <w:r>
-        <w:t>, the user should be able to:</w:t>
+        <w:t>With JetStock, the user should be able to:</w:t>
       </w:r>
     </w:p>
     <w:p>
@@ -394,21 +379,8 @@
       </w:r>
     </w:p>
     <w:p>
-      <w:proofErr w:type="spellStart"/>
-      <w:r>
-        <w:t>JetStock</w:t>
-      </w:r>
-      <w:proofErr w:type="spellEnd"/>
-      <w:r>
-        <w:t xml:space="preserve"> sits in the inventory and operations domain. Many existing systems are designed for bigger operations, while </w:t>
-      </w:r>
-      <w:proofErr w:type="spellStart"/>
-      <w:r>
-        <w:t>JetStock</w:t>
-      </w:r>
-      <w:proofErr w:type="spellEnd"/>
-      <w:r>
-        <w:t xml:space="preserve"> aims to be simpler and more usable for smaller ones especially relevant for:</w:t>
+      <w:r>
+        <w:t>JetStock sits in the inventory and operations domain. Many existing systems are designed for bigger operations, while JetStock aims to be simpler and more usable for smaller ones especially relevant for:</w:t>
       </w:r>
     </w:p>
     <w:p>
@@ -590,13 +562,8 @@
       </w:r>
     </w:p>
     <w:p>
-      <w:proofErr w:type="spellStart"/>
-      <w:r>
-        <w:t>JetStock</w:t>
-      </w:r>
-      <w:proofErr w:type="spellEnd"/>
-      <w:r>
-        <w:t xml:space="preserve"> provides a lightweight and practical inventory management solution for small businesses that do not need a large enterprise software. It </w:t>
+      <w:r>
+        <w:t xml:space="preserve">JetStock provides a lightweight and practical inventory management solution for small businesses that do not need a large enterprise software. It </w:t>
       </w:r>
       <w:r>
         <w:t>focuses</w:t>
@@ -1331,23 +1298,9 @@
           <w:numId w:val="18"/>
         </w:numPr>
       </w:pPr>
-      <w:proofErr w:type="spellStart"/>
       <w:r>
         <w:t>MySql</w:t>
       </w:r>
-      <w:proofErr w:type="spellEnd"/>
-    </w:p>
-    <w:p>
-      <w:pPr>
-        <w:pStyle w:val="ListParagraph"/>
-        <w:numPr>
-          <w:ilvl w:val="0"/>
-          <w:numId w:val="18"/>
-        </w:numPr>
-      </w:pPr>
-      <w:r>
-        <w:t>Redis Cache</w:t>
-      </w:r>
     </w:p>
     <w:p>
       <w:pPr>
@@ -1378,6 +1331,18 @@
         </w:numPr>
       </w:pPr>
       <w:r>
+        <w:t>Vitest (React Testing)</w:t>
+      </w:r>
+    </w:p>
+    <w:p>
+      <w:pPr>
+        <w:pStyle w:val="ListParagraph"/>
+        <w:numPr>
+          <w:ilvl w:val="0"/>
+          <w:numId w:val="19"/>
+        </w:numPr>
+      </w:pPr>
+      <w:r>
         <w:t>Postman (API testing)</w:t>
       </w:r>
     </w:p>
@@ -1386,122 +1351,99 @@
         <w:pStyle w:val="Heading4"/>
       </w:pPr>
       <w:r>
-        <w:t>Deployment</w:t>
-      </w:r>
-    </w:p>
-    <w:p>
-      <w:pPr>
-        <w:pStyle w:val="ListParagraph"/>
-        <w:numPr>
-          <w:ilvl w:val="0"/>
-          <w:numId w:val="20"/>
-        </w:numPr>
-      </w:pPr>
-      <w:r>
-        <w:t xml:space="preserve">Frontend: Netlify or </w:t>
-      </w:r>
-      <w:proofErr w:type="spellStart"/>
-      <w:r>
-        <w:t>Vercel</w:t>
-      </w:r>
-      <w:proofErr w:type="spellEnd"/>
-    </w:p>
-    <w:p>
-      <w:pPr>
-        <w:pStyle w:val="ListParagraph"/>
-        <w:numPr>
-          <w:ilvl w:val="0"/>
-          <w:numId w:val="20"/>
-        </w:numPr>
-      </w:pPr>
-      <w:r>
-        <w:t>Backend: Render/Railway/ EC2</w:t>
-      </w:r>
-    </w:p>
-    <w:p>
-      <w:pPr>
-        <w:pStyle w:val="ListParagraph"/>
-        <w:numPr>
-          <w:ilvl w:val="0"/>
-          <w:numId w:val="20"/>
-        </w:numPr>
-      </w:pPr>
-      <w:r>
-        <w:t xml:space="preserve">Database: </w:t>
-      </w:r>
-      <w:proofErr w:type="spellStart"/>
-      <w:r>
-        <w:t>Mysql</w:t>
-      </w:r>
-      <w:proofErr w:type="spellEnd"/>
+        <w:t>Structure (MVC)</w:t>
+      </w:r>
+    </w:p>
+    <w:p>
+      <w:pPr>
+        <w:pStyle w:val="ListParagraph"/>
+        <w:numPr>
+          <w:ilvl w:val="0"/>
+          <w:numId w:val="19"/>
+        </w:numPr>
+      </w:pPr>
+      <w:r>
+        <w:t>Routes</w:t>
+      </w:r>
+    </w:p>
+    <w:p>
+      <w:pPr>
+        <w:pStyle w:val="ListParagraph"/>
+        <w:numPr>
+          <w:ilvl w:val="0"/>
+          <w:numId w:val="19"/>
+        </w:numPr>
+      </w:pPr>
+      <w:r>
+        <w:t>Controllers</w:t>
+      </w:r>
+    </w:p>
+    <w:p>
+      <w:pPr>
+        <w:pStyle w:val="ListParagraph"/>
+        <w:numPr>
+          <w:ilvl w:val="0"/>
+          <w:numId w:val="19"/>
+        </w:numPr>
+      </w:pPr>
+      <w:r>
+        <w:t>Models</w:t>
+      </w:r>
+    </w:p>
+    <w:p>
+      <w:pPr>
+        <w:pStyle w:val="ListParagraph"/>
+        <w:numPr>
+          <w:ilvl w:val="0"/>
+          <w:numId w:val="19"/>
+        </w:numPr>
+      </w:pPr>
+      <w:r>
+        <w:t>Services</w:t>
+      </w:r>
+    </w:p>
+    <w:p>
+      <w:pPr>
+        <w:pStyle w:val="ListParagraph"/>
+        <w:numPr>
+          <w:ilvl w:val="0"/>
+          <w:numId w:val="19"/>
+        </w:numPr>
+      </w:pPr>
+      <w:r>
+        <w:t>Middleware</w:t>
+      </w:r>
     </w:p>
     <w:p>
       <w:pPr>
         <w:pStyle w:val="Heading4"/>
       </w:pPr>
       <w:r>
-        <w:t>Structure (MVC)</w:t>
-      </w:r>
-    </w:p>
-    <w:p>
-      <w:pPr>
-        <w:pStyle w:val="ListParagraph"/>
-        <w:numPr>
-          <w:ilvl w:val="0"/>
-          <w:numId w:val="19"/>
-        </w:numPr>
-      </w:pPr>
-      <w:r>
-        <w:t>Routes</w:t>
-      </w:r>
-    </w:p>
-    <w:p>
-      <w:pPr>
-        <w:pStyle w:val="ListParagraph"/>
-        <w:numPr>
-          <w:ilvl w:val="0"/>
-          <w:numId w:val="19"/>
-        </w:numPr>
-      </w:pPr>
-      <w:r>
-        <w:t>Controllers</w:t>
-      </w:r>
-    </w:p>
-    <w:p>
-      <w:pPr>
-        <w:pStyle w:val="ListParagraph"/>
-        <w:numPr>
-          <w:ilvl w:val="0"/>
-          <w:numId w:val="19"/>
-        </w:numPr>
-      </w:pPr>
-      <w:r>
-        <w:t>Models</w:t>
-      </w:r>
-    </w:p>
-    <w:p>
-      <w:pPr>
-        <w:pStyle w:val="ListParagraph"/>
-        <w:numPr>
-          <w:ilvl w:val="0"/>
-          <w:numId w:val="19"/>
-        </w:numPr>
+        <w:t>Version Control</w:t>
+      </w:r>
+    </w:p>
+    <w:p>
+      <w:pPr>
+        <w:pStyle w:val="ListParagraph"/>
+        <w:numPr>
+          <w:ilvl w:val="0"/>
+          <w:numId w:val="21"/>
+        </w:numPr>
+      </w:pPr>
+      <w:r>
+        <w:t>Git</w:t>
+      </w:r>
+      <w:r>
+        <w:t>Hub</w:t>
+      </w:r>
+    </w:p>
+    <w:p>
+      <w:pPr>
+        <w:pStyle w:val="Heading2"/>
       </w:pPr>
       <w:r>
         <w:lastRenderedPageBreak/>
-        <w:t>Services</w:t>
-      </w:r>
-    </w:p>
-    <w:p>
-      <w:pPr>
-        <w:pStyle w:val="ListParagraph"/>
-        <w:numPr>
-          <w:ilvl w:val="0"/>
-          <w:numId w:val="19"/>
-        </w:numPr>
-      </w:pPr>
-      <w:r>
-        <w:t>Middleware</w:t>
+        <w:t>Architecture Diagram</w:t>
       </w:r>
     </w:p>
     <w:p>
@@ -1509,19 +1451,94 @@
         <w:pStyle w:val="Heading4"/>
       </w:pPr>
       <w:r>
-        <w:t>Version Control</w:t>
-      </w:r>
-    </w:p>
-    <w:p>
-      <w:pPr>
-        <w:pStyle w:val="ListParagraph"/>
-        <w:numPr>
-          <w:ilvl w:val="0"/>
-          <w:numId w:val="21"/>
-        </w:numPr>
-      </w:pPr>
-      <w:r>
-        <w:t>Git + GitHub</w:t>
+        <w:t>System Architecture</w:t>
+      </w:r>
+    </w:p>
+    <w:p>
+      <w:r>
+        <w:t>Jetstock</w:t>
+      </w:r>
+      <w:r>
+        <w:t xml:space="preserve"> follow a clien</w:t>
+      </w:r>
+      <w:r>
+        <w:t>t</w:t>
+      </w:r>
+      <w:r>
+        <w:t>-server architecture. The frontend is built using React and Material UI, and communicates with the backend through Axios-based HTTP requests. The backend is developed with Node.js and Express using MVC architecture to separates routes, controllers, business logic, and database interaction. MySql is used as the relational database to store products, categories, suppliers, inventory and stock movement records.</w:t>
+      </w:r>
+    </w:p>
+    <w:p/>
+    <w:p>
+      <w:pPr>
+        <w:rPr>
+          <w:highlight w:val="yellow"/>
+        </w:rPr>
+      </w:pPr>
+    </w:p>
+    <w:p>
+      <w:pPr>
+        <w:rPr>
+          <w:highlight w:val="yellow"/>
+        </w:rPr>
+      </w:pPr>
+      <w:r>
+        <w:rPr>
+          <w:noProof/>
+        </w:rPr>
+        <w:drawing>
+          <wp:inline distT="0" distB="0" distL="0" distR="0" wp14:anchorId="4A536CA1" wp14:editId="1D16F33C">
+            <wp:extent cx="5731510" cy="3479800"/>
+            <wp:effectExtent l="0" t="0" r="2540" b="6350"/>
+            <wp:docPr id="926500539" name="Picture 1"/>
+            <wp:cNvGraphicFramePr>
+              <a:graphicFrameLocks xmlns:a="http://schemas.openxmlformats.org/drawingml/2006/main" noChangeAspect="1"/>
+            </wp:cNvGraphicFramePr>
+            <a:graphic xmlns:a="http://schemas.openxmlformats.org/drawingml/2006/main">
+              <a:graphicData uri="http://schemas.openxmlformats.org/drawingml/2006/picture">
+                <pic:pic xmlns:pic="http://schemas.openxmlformats.org/drawingml/2006/picture">
+                  <pic:nvPicPr>
+                    <pic:cNvPr id="926500539" name="Picture 926500539"/>
+                    <pic:cNvPicPr/>
+                  </pic:nvPicPr>
+                  <pic:blipFill>
+                    <a:blip r:embed="rId6" cstate="print">
+                      <a:extLst>
+                        <a:ext uri="{28A0092B-C50C-407E-A947-70E740481C1C}">
+                          <a14:useLocalDpi xmlns:a14="http://schemas.microsoft.com/office/drawing/2010/main" val="0"/>
+                        </a:ext>
+                      </a:extLst>
+                    </a:blip>
+                    <a:stretch>
+                      <a:fillRect/>
+                    </a:stretch>
+                  </pic:blipFill>
+                  <pic:spPr>
+                    <a:xfrm>
+                      <a:off x="0" y="0"/>
+                      <a:ext cx="5731510" cy="3479800"/>
+                    </a:xfrm>
+                    <a:prstGeom prst="rect">
+                      <a:avLst/>
+                    </a:prstGeom>
+                  </pic:spPr>
+                </pic:pic>
+              </a:graphicData>
+            </a:graphic>
+          </wp:inline>
+        </w:drawing>
+      </w:r>
+    </w:p>
+    <w:p>
+      <w:pPr>
+        <w:rPr>
+          <w:rFonts w:eastAsia="Times New Roman"/>
+          <w:sz w:val="32"/>
+          <w:szCs w:val="32"/>
+        </w:rPr>
+      </w:pPr>
+      <w:r>
+        <w:br w:type="page"/>
       </w:r>
     </w:p>
     <w:p>
@@ -1529,77 +1546,7 @@
         <w:pStyle w:val="Heading2"/>
       </w:pPr>
       <w:r>
-        <w:t>Architecture Diagram</w:t>
-      </w:r>
-    </w:p>
-    <w:p>
-      <w:pPr>
-        <w:pStyle w:val="Heading4"/>
-      </w:pPr>
-      <w:r>
-        <w:t>System Architecture</w:t>
-      </w:r>
-    </w:p>
-    <w:p>
-      <w:proofErr w:type="spellStart"/>
-      <w:r>
-        <w:t>Jetstock</w:t>
-      </w:r>
-      <w:proofErr w:type="spellEnd"/>
-      <w:r>
-        <w:t xml:space="preserve"> follow a </w:t>
-      </w:r>
-      <w:proofErr w:type="spellStart"/>
-      <w:r>
-        <w:t>clien</w:t>
-      </w:r>
-      <w:proofErr w:type="spellEnd"/>
-      <w:r>
-        <w:t xml:space="preserve">-server architecture. The frontend is built using React and Material </w:t>
-      </w:r>
-      <w:proofErr w:type="gramStart"/>
-      <w:r>
-        <w:t>UI, and</w:t>
-      </w:r>
-      <w:proofErr w:type="gramEnd"/>
-      <w:r>
-        <w:t xml:space="preserve"> communicates with the backend through Axios-based HTTP requests. The backend is developed with Node.js and Express using MVC architecture to separates routes, controllers, business logic, and database interaction. </w:t>
-      </w:r>
-      <w:proofErr w:type="spellStart"/>
-      <w:r>
-        <w:t>MySql</w:t>
-      </w:r>
-      <w:proofErr w:type="spellEnd"/>
-      <w:r>
-        <w:t xml:space="preserve"> is used as the relational database to store products, categories, suppliers, inventory and stock movement records.</w:t>
-      </w:r>
-    </w:p>
-    <w:p/>
-    <w:p>
-      <w:pPr>
-        <w:rPr>
-          <w:highlight w:val="yellow"/>
-        </w:rPr>
-      </w:pPr>
-      <w:r>
-        <w:rPr>
-          <w:highlight w:val="yellow"/>
-        </w:rPr>
-        <w:t>Include a diagram of the building blocks of the design including users and how they interact with the product.</w:t>
-      </w:r>
-    </w:p>
-    <w:p>
-      <w:pPr>
-        <w:rPr>
-          <w:highlight w:val="yellow"/>
-        </w:rPr>
-      </w:pPr>
-    </w:p>
-    <w:p>
-      <w:pPr>
-        <w:pStyle w:val="Heading2"/>
-      </w:pPr>
-      <w:r>
+        <w:lastRenderedPageBreak/>
         <w:t>User Stories</w:t>
       </w:r>
     </w:p>
@@ -1887,15 +1834,7 @@
           </w:tcPr>
           <w:p>
             <w:r>
-              <w:t xml:space="preserve">List </w:t>
-            </w:r>
-            <w:proofErr w:type="gramStart"/>
-            <w:r>
-              <w:t>by:</w:t>
-            </w:r>
-            <w:proofErr w:type="gramEnd"/>
-            <w:r>
-              <w:t xml:space="preserve"> name, category, supplier, Qty, edit/delete</w:t>
+              <w:t>List by: name, category, supplier, Qty, edit/delete</w:t>
             </w:r>
           </w:p>
         </w:tc>
@@ -2358,14 +2297,30 @@
         </w:rPr>
         <w:t xml:space="preserve">: </w:t>
       </w:r>
-      <w:hyperlink r:id="rId6" w:history="1">
+      <w:hyperlink r:id="rId7" w:history="1">
         <w:r>
           <w:rPr>
             <w:rStyle w:val="Hyperlink"/>
             <w:sz w:val="16"/>
             <w:szCs w:val="16"/>
           </w:rPr>
-          <w:t>https://drive.google.com/file/d/1MXYz-eideYcytwEZzE_zcrA1COw-gLBQ/view?usp=sharing</w:t>
+          <w:t>https://drive.google.com/file/d/1MXYz-eideYcytwEZ</w:t>
+        </w:r>
+        <w:r>
+          <w:rPr>
+            <w:rStyle w:val="Hyperlink"/>
+            <w:sz w:val="16"/>
+            <w:szCs w:val="16"/>
+          </w:rPr>
+          <w:t>z</w:t>
+        </w:r>
+        <w:r>
+          <w:rPr>
+            <w:rStyle w:val="Hyperlink"/>
+            <w:sz w:val="16"/>
+            <w:szCs w:val="16"/>
+          </w:rPr>
+          <w:t>E_zcrA1COw-gLBQ/view?usp=sharing</w:t>
         </w:r>
       </w:hyperlink>
     </w:p>
@@ -2386,9 +2341,9 @@
           <w:noProof/>
         </w:rPr>
         <w:drawing>
-          <wp:inline distT="0" distB="0" distL="0" distR="0" wp14:anchorId="002EC78F" wp14:editId="029ED585">
-            <wp:extent cx="5731510" cy="8109585"/>
-            <wp:effectExtent l="0" t="0" r="2540" b="5715"/>
+          <wp:inline distT="0" distB="0" distL="0" distR="0" wp14:anchorId="002EC78F" wp14:editId="7847CF46">
+            <wp:extent cx="5731510" cy="3583126"/>
+            <wp:effectExtent l="0" t="0" r="2540" b="0"/>
             <wp:docPr id="707938048" name="Picture 1"/>
             <wp:cNvGraphicFramePr>
               <a:graphicFrameLocks xmlns:a="http://schemas.openxmlformats.org/drawingml/2006/main" noChangeAspect="1"/>
@@ -2397,69 +2352,7 @@
               <a:graphicData uri="http://schemas.openxmlformats.org/drawingml/2006/picture">
                 <pic:pic xmlns:pic="http://schemas.openxmlformats.org/drawingml/2006/picture">
                   <pic:nvPicPr>
-                    <pic:cNvPr id="707938048" name="Picture 707938048"/>
-                    <pic:cNvPicPr/>
-                  </pic:nvPicPr>
-                  <pic:blipFill>
-                    <a:blip r:embed="rId7" cstate="print">
-                      <a:extLst>
-                        <a:ext uri="{28A0092B-C50C-407E-A947-70E740481C1C}">
-                          <a14:useLocalDpi xmlns:a14="http://schemas.microsoft.com/office/drawing/2010/main" val="0"/>
-                        </a:ext>
-                      </a:extLst>
-                    </a:blip>
-                    <a:stretch>
-                      <a:fillRect/>
-                    </a:stretch>
-                  </pic:blipFill>
-                  <pic:spPr>
-                    <a:xfrm>
-                      <a:off x="0" y="0"/>
-                      <a:ext cx="5731510" cy="8109585"/>
-                    </a:xfrm>
-                    <a:prstGeom prst="rect">
-                      <a:avLst/>
-                    </a:prstGeom>
-                  </pic:spPr>
-                </pic:pic>
-              </a:graphicData>
-            </a:graphic>
-          </wp:inline>
-        </w:drawing>
-      </w:r>
-    </w:p>
-    <w:p>
-      <w:pPr>
-        <w:pStyle w:val="Heading4"/>
-      </w:pPr>
-      <w:r>
-        <w:lastRenderedPageBreak/>
-        <w:t>User Product/Category/Supplier Management</w:t>
-      </w:r>
-    </w:p>
-    <w:p>
-      <w:pPr>
-        <w:rPr>
-          <w:highlight w:val="yellow"/>
-        </w:rPr>
-      </w:pPr>
-      <w:r>
-        <w:rPr>
-          <w:noProof/>
-        </w:rPr>
-        <w:drawing>
-          <wp:inline distT="0" distB="0" distL="0" distR="0" wp14:anchorId="34E62A1D" wp14:editId="17E33617">
-            <wp:extent cx="5731510" cy="8109585"/>
-            <wp:effectExtent l="0" t="0" r="2540" b="5715"/>
-            <wp:docPr id="2136595789" name="Picture 2"/>
-            <wp:cNvGraphicFramePr>
-              <a:graphicFrameLocks xmlns:a="http://schemas.openxmlformats.org/drawingml/2006/main" noChangeAspect="1"/>
-            </wp:cNvGraphicFramePr>
-            <a:graphic xmlns:a="http://schemas.openxmlformats.org/drawingml/2006/main">
-              <a:graphicData uri="http://schemas.openxmlformats.org/drawingml/2006/picture">
-                <pic:pic xmlns:pic="http://schemas.openxmlformats.org/drawingml/2006/picture">
-                  <pic:nvPicPr>
-                    <pic:cNvPr id="2136595789" name="Picture 2136595789"/>
+                    <pic:cNvPr id="707938048" name="Picture 1"/>
                     <pic:cNvPicPr/>
                   </pic:nvPicPr>
                   <pic:blipFill>
@@ -2477,7 +2370,7 @@
                   <pic:spPr>
                     <a:xfrm>
                       <a:off x="0" y="0"/>
-                      <a:ext cx="5731510" cy="8109585"/>
+                      <a:ext cx="5731510" cy="3583126"/>
                     </a:xfrm>
                     <a:prstGeom prst="rect">
                       <a:avLst/>
@@ -2496,33 +2389,15 @@
           <w:highlight w:val="yellow"/>
         </w:rPr>
       </w:pPr>
-    </w:p>
-    <w:p>
-      <w:pPr>
-        <w:rPr>
-          <w:highlight w:val="yellow"/>
-        </w:rPr>
-      </w:pPr>
-    </w:p>
-    <w:p>
-      <w:pPr>
-        <w:pStyle w:val="Heading4"/>
-      </w:pPr>
-      <w:r>
-        <w:lastRenderedPageBreak/>
-        <w:t>Inventory Management</w:t>
-      </w:r>
-    </w:p>
-    <w:p>
       <w:r>
         <w:rPr>
           <w:noProof/>
         </w:rPr>
         <w:drawing>
-          <wp:inline distT="0" distB="0" distL="0" distR="0" wp14:anchorId="2C4339B8" wp14:editId="6AAD5D5A">
-            <wp:extent cx="5731510" cy="8109585"/>
-            <wp:effectExtent l="0" t="0" r="2540" b="5715"/>
-            <wp:docPr id="223414133" name="Picture 3"/>
+          <wp:inline distT="0" distB="0" distL="0" distR="0" wp14:anchorId="34E62A1D" wp14:editId="251D836E">
+            <wp:extent cx="5731510" cy="3583126"/>
+            <wp:effectExtent l="0" t="0" r="2540" b="0"/>
+            <wp:docPr id="2136595789" name="Picture 2"/>
             <wp:cNvGraphicFramePr>
               <a:graphicFrameLocks xmlns:a="http://schemas.openxmlformats.org/drawingml/2006/main" noChangeAspect="1"/>
             </wp:cNvGraphicFramePr>
@@ -2530,7 +2405,7 @@
               <a:graphicData uri="http://schemas.openxmlformats.org/drawingml/2006/picture">
                 <pic:pic xmlns:pic="http://schemas.openxmlformats.org/drawingml/2006/picture">
                   <pic:nvPicPr>
-                    <pic:cNvPr id="223414133" name="Picture 223414133"/>
+                    <pic:cNvPr id="2136595789" name="Picture 2"/>
                     <pic:cNvPicPr/>
                   </pic:nvPicPr>
                   <pic:blipFill>
@@ -2548,7 +2423,7 @@
                   <pic:spPr>
                     <a:xfrm>
                       <a:off x="0" y="0"/>
-                      <a:ext cx="5731510" cy="8109585"/>
+                      <a:ext cx="5731510" cy="3583126"/>
                     </a:xfrm>
                     <a:prstGeom prst="rect">
                       <a:avLst/>
@@ -2561,7 +2436,22 @@
         </w:drawing>
       </w:r>
     </w:p>
+    <w:p>
+      <w:pPr>
+        <w:rPr>
+          <w:highlight w:val="yellow"/>
+        </w:rPr>
+      </w:pPr>
+    </w:p>
+    <w:p>
+      <w:pPr>
+        <w:rPr>
+          <w:highlight w:val="yellow"/>
+        </w:rPr>
+      </w:pPr>
+    </w:p>
     <w:p/>
+    <w:p/>
     <w:p>
       <w:pPr>
         <w:rPr>
@@ -2571,166 +2461,38 @@
     </w:p>
     <w:p>
       <w:pPr>
-        <w:pStyle w:val="Heading4"/>
+        <w:pStyle w:val="Heading2"/>
+        <w:spacing w:before="0" w:line="240" w:lineRule="auto"/>
       </w:pPr>
       <w:r>
         <w:lastRenderedPageBreak/>
-        <w:t>Reporting</w:t>
-      </w:r>
-    </w:p>
-    <w:p>
-      <w:r>
-        <w:rPr>
-          <w:noProof/>
-        </w:rPr>
-        <w:drawing>
-          <wp:inline distT="0" distB="0" distL="0" distR="0" wp14:anchorId="71E20989" wp14:editId="2674D21D">
-            <wp:extent cx="5731510" cy="8109585"/>
-            <wp:effectExtent l="0" t="0" r="2540" b="5715"/>
-            <wp:docPr id="1750501920" name="Picture 4"/>
-            <wp:cNvGraphicFramePr>
-              <a:graphicFrameLocks xmlns:a="http://schemas.openxmlformats.org/drawingml/2006/main" noChangeAspect="1"/>
-            </wp:cNvGraphicFramePr>
-            <a:graphic xmlns:a="http://schemas.openxmlformats.org/drawingml/2006/main">
-              <a:graphicData uri="http://schemas.openxmlformats.org/drawingml/2006/picture">
-                <pic:pic xmlns:pic="http://schemas.openxmlformats.org/drawingml/2006/picture">
-                  <pic:nvPicPr>
-                    <pic:cNvPr id="1750501920" name="Picture 1750501920"/>
-                    <pic:cNvPicPr/>
-                  </pic:nvPicPr>
-                  <pic:blipFill>
-                    <a:blip r:embed="rId10" cstate="print">
-                      <a:extLst>
-                        <a:ext uri="{28A0092B-C50C-407E-A947-70E740481C1C}">
-                          <a14:useLocalDpi xmlns:a14="http://schemas.microsoft.com/office/drawing/2010/main" val="0"/>
-                        </a:ext>
-                      </a:extLst>
-                    </a:blip>
-                    <a:stretch>
-                      <a:fillRect/>
-                    </a:stretch>
-                  </pic:blipFill>
-                  <pic:spPr>
-                    <a:xfrm>
-                      <a:off x="0" y="0"/>
-                      <a:ext cx="5731510" cy="8109585"/>
-                    </a:xfrm>
-                    <a:prstGeom prst="rect">
-                      <a:avLst/>
-                    </a:prstGeom>
-                  </pic:spPr>
-                </pic:pic>
-              </a:graphicData>
-            </a:graphic>
-          </wp:inline>
-        </w:drawing>
+        <w:t>Database Model: ERD diagram</w:t>
       </w:r>
     </w:p>
     <w:p>
       <w:pPr>
         <w:pStyle w:val="Heading2"/>
+        <w:spacing w:before="0" w:line="240" w:lineRule="auto"/>
         <w:rPr>
           <w:sz w:val="16"/>
           <w:szCs w:val="16"/>
         </w:rPr>
       </w:pPr>
-    </w:p>
-    <w:p>
-      <w:pPr>
-        <w:pStyle w:val="Heading2"/>
-        <w:spacing w:before="0" w:line="240" w:lineRule="auto"/>
-      </w:pPr>
-      <w:r>
-        <w:t>Database Model: ERD diagram</w:t>
-      </w:r>
-    </w:p>
-    <w:p>
-      <w:pPr>
-        <w:pStyle w:val="Heading2"/>
-        <w:spacing w:before="0" w:line="240" w:lineRule="auto"/>
-        <w:rPr>
-          <w:sz w:val="16"/>
-          <w:szCs w:val="16"/>
-        </w:rPr>
-      </w:pPr>
       <w:r>
         <w:rPr>
           <w:noProof/>
         </w:rPr>
         <w:drawing>
-          <wp:anchor distT="0" distB="0" distL="114300" distR="114300" simplePos="0" relativeHeight="251672576" behindDoc="0" locked="0" layoutInCell="1" allowOverlap="1" wp14:anchorId="0B7F1128" wp14:editId="2E62FC46">
+          <wp:anchor distT="0" distB="0" distL="114300" distR="114300" simplePos="0" relativeHeight="251670528" behindDoc="0" locked="0" layoutInCell="1" allowOverlap="1" wp14:anchorId="421C5A72" wp14:editId="615F6E76">
             <wp:simplePos x="0" y="0"/>
             <wp:positionH relativeFrom="column">
-              <wp:posOffset>0</wp:posOffset>
+              <wp:posOffset>-451485</wp:posOffset>
             </wp:positionH>
             <wp:positionV relativeFrom="paragraph">
-              <wp:posOffset>3775075</wp:posOffset>
+              <wp:posOffset>363220</wp:posOffset>
             </wp:positionV>
-            <wp:extent cx="6207125" cy="3768725"/>
-            <wp:effectExtent l="0" t="0" r="3175" b="3175"/>
-            <wp:wrapTopAndBottom/>
-            <wp:docPr id="389049509" name="Picture 18"/>
-            <wp:cNvGraphicFramePr>
-              <a:graphicFrameLocks xmlns:a="http://schemas.openxmlformats.org/drawingml/2006/main" noChangeAspect="1"/>
-            </wp:cNvGraphicFramePr>
-            <a:graphic xmlns:a="http://schemas.openxmlformats.org/drawingml/2006/main">
-              <a:graphicData uri="http://schemas.openxmlformats.org/drawingml/2006/picture">
-                <pic:pic xmlns:pic="http://schemas.openxmlformats.org/drawingml/2006/picture">
-                  <pic:nvPicPr>
-                    <pic:cNvPr id="389049509" name="Picture 18"/>
-                    <pic:cNvPicPr>
-                      <a:picLocks noChangeAspect="1" noChangeArrowheads="1"/>
-                    </pic:cNvPicPr>
-                  </pic:nvPicPr>
-                  <pic:blipFill>
-                    <a:blip r:embed="rId11" cstate="print">
-                      <a:extLst>
-                        <a:ext uri="{28A0092B-C50C-407E-A947-70E740481C1C}">
-                          <a14:useLocalDpi xmlns:a14="http://schemas.microsoft.com/office/drawing/2010/main" val="0"/>
-                        </a:ext>
-                      </a:extLst>
-                    </a:blip>
-                    <a:stretch>
-                      <a:fillRect/>
-                    </a:stretch>
-                  </pic:blipFill>
-                  <pic:spPr bwMode="auto">
-                    <a:xfrm>
-                      <a:off x="0" y="0"/>
-                      <a:ext cx="6207125" cy="3768725"/>
-                    </a:xfrm>
-                    <a:prstGeom prst="rect">
-                      <a:avLst/>
-                    </a:prstGeom>
-                    <a:noFill/>
-                    <a:ln>
-                      <a:noFill/>
-                    </a:ln>
-                  </pic:spPr>
-                </pic:pic>
-              </a:graphicData>
-            </a:graphic>
-            <wp14:sizeRelV relativeFrom="margin">
-              <wp14:pctHeight>0</wp14:pctHeight>
-            </wp14:sizeRelV>
-          </wp:anchor>
-        </w:drawing>
-      </w:r>
-      <w:r>
-        <w:rPr>
-          <w:noProof/>
-        </w:rPr>
-        <w:drawing>
-          <wp:anchor distT="0" distB="0" distL="114300" distR="114300" simplePos="0" relativeHeight="251670528" behindDoc="0" locked="0" layoutInCell="1" allowOverlap="1" wp14:anchorId="421C5A72" wp14:editId="220ED736">
-            <wp:simplePos x="0" y="0"/>
-            <wp:positionH relativeFrom="column">
-              <wp:posOffset>0</wp:posOffset>
-            </wp:positionH>
-            <wp:positionV relativeFrom="paragraph">
-              <wp:posOffset>160655</wp:posOffset>
-            </wp:positionV>
-            <wp:extent cx="6207760" cy="3768725"/>
-            <wp:effectExtent l="0" t="0" r="2540" b="3175"/>
+            <wp:extent cx="6503135" cy="4606290"/>
+            <wp:effectExtent l="0" t="0" r="0" b="3810"/>
             <wp:wrapTopAndBottom/>
             <wp:docPr id="2013506566" name="Picture 18"/>
             <wp:cNvGraphicFramePr>
@@ -2746,7 +2508,7 @@
                     </pic:cNvPicPr>
                   </pic:nvPicPr>
                   <pic:blipFill>
-                    <a:blip r:embed="rId12" cstate="print">
+                    <a:blip r:embed="rId10" cstate="print">
                       <a:extLst>
                         <a:ext uri="{28A0092B-C50C-407E-A947-70E740481C1C}">
                           <a14:useLocalDpi xmlns:a14="http://schemas.microsoft.com/office/drawing/2010/main" val="0"/>
@@ -2760,7 +2522,7 @@
                   <pic:spPr bwMode="auto">
                     <a:xfrm>
                       <a:off x="0" y="0"/>
-                      <a:ext cx="6207760" cy="3768725"/>
+                      <a:ext cx="6503135" cy="4606290"/>
                     </a:xfrm>
                     <a:prstGeom prst="rect">
                       <a:avLst/>
@@ -2773,13 +2535,16 @@
                 </pic:pic>
               </a:graphicData>
             </a:graphic>
+            <wp14:sizeRelH relativeFrom="margin">
+              <wp14:pctWidth>0</wp14:pctWidth>
+            </wp14:sizeRelH>
             <wp14:sizeRelV relativeFrom="margin">
               <wp14:pctHeight>0</wp14:pctHeight>
             </wp14:sizeRelV>
           </wp:anchor>
         </w:drawing>
       </w:r>
-      <w:hyperlink r:id="rId13" w:history="1">
+      <w:hyperlink r:id="rId11" w:history="1">
         <w:r>
           <w:rPr>
             <w:rStyle w:val="Hyperlink"/>
@@ -2796,7 +2561,6 @@
         <w:pStyle w:val="Heading2"/>
       </w:pPr>
       <w:r>
-        <w:lastRenderedPageBreak/>
         <w:t>Wireframe Design</w:t>
       </w:r>
     </w:p>
@@ -2828,7 +2592,7 @@
         </w:rPr>
         <w:t xml:space="preserve">: </w:t>
       </w:r>
-      <w:hyperlink r:id="rId14" w:history="1">
+      <w:hyperlink r:id="rId12" w:history="1">
         <w:r>
           <w:rPr>
             <w:rStyle w:val="Hyperlink"/>
@@ -2874,7 +2638,7 @@
                     <pic:cNvPicPr/>
                   </pic:nvPicPr>
                   <pic:blipFill>
-                    <a:blip r:embed="rId15" cstate="print">
+                    <a:blip r:embed="rId13" cstate="print">
                       <a:extLst>
                         <a:ext uri="{28A0092B-C50C-407E-A947-70E740481C1C}">
                           <a14:useLocalDpi xmlns:a14="http://schemas.microsoft.com/office/drawing/2010/main" val="0"/>
@@ -2934,7 +2698,7 @@
                     <pic:cNvPicPr/>
                   </pic:nvPicPr>
                   <pic:blipFill>
-                    <a:blip r:embed="rId16" cstate="print">
+                    <a:blip r:embed="rId14" cstate="print">
                       <a:extLst>
                         <a:ext uri="{28A0092B-C50C-407E-A947-70E740481C1C}">
                           <a14:useLocalDpi xmlns:a14="http://schemas.microsoft.com/office/drawing/2010/main" val="0"/>
@@ -2996,7 +2760,7 @@
                     <pic:cNvPicPr/>
                   </pic:nvPicPr>
                   <pic:blipFill>
-                    <a:blip r:embed="rId17" cstate="print">
+                    <a:blip r:embed="rId15" cstate="print">
                       <a:extLst>
                         <a:ext uri="{28A0092B-C50C-407E-A947-70E740481C1C}">
                           <a14:useLocalDpi xmlns:a14="http://schemas.microsoft.com/office/drawing/2010/main" val="0"/>
@@ -3058,7 +2822,7 @@
                     <pic:cNvPicPr/>
                   </pic:nvPicPr>
                   <pic:blipFill>
-                    <a:blip r:embed="rId18" cstate="print">
+                    <a:blip r:embed="rId16" cstate="print">
                       <a:extLst>
                         <a:ext uri="{28A0092B-C50C-407E-A947-70E740481C1C}">
                           <a14:useLocalDpi xmlns:a14="http://schemas.microsoft.com/office/drawing/2010/main" val="0"/>
@@ -3120,7 +2884,7 @@
                     <pic:cNvPicPr/>
                   </pic:nvPicPr>
                   <pic:blipFill>
-                    <a:blip r:embed="rId19" cstate="print">
+                    <a:blip r:embed="rId17" cstate="print">
                       <a:extLst>
                         <a:ext uri="{28A0092B-C50C-407E-A947-70E740481C1C}">
                           <a14:useLocalDpi xmlns:a14="http://schemas.microsoft.com/office/drawing/2010/main" val="0"/>
@@ -3182,7 +2946,7 @@
                     <pic:cNvPicPr/>
                   </pic:nvPicPr>
                   <pic:blipFill>
-                    <a:blip r:embed="rId20" cstate="print">
+                    <a:blip r:embed="rId18" cstate="print">
                       <a:extLst>
                         <a:ext uri="{28A0092B-C50C-407E-A947-70E740481C1C}">
                           <a14:useLocalDpi xmlns:a14="http://schemas.microsoft.com/office/drawing/2010/main" val="0"/>
@@ -3244,7 +3008,7 @@
                     <pic:cNvPicPr/>
                   </pic:nvPicPr>
                   <pic:blipFill>
-                    <a:blip r:embed="rId21" cstate="print">
+                    <a:blip r:embed="rId19" cstate="print">
                       <a:extLst>
                         <a:ext uri="{28A0092B-C50C-407E-A947-70E740481C1C}">
                           <a14:useLocalDpi xmlns:a14="http://schemas.microsoft.com/office/drawing/2010/main" val="0"/>
@@ -3306,7 +3070,7 @@
                     <pic:cNvPicPr/>
                   </pic:nvPicPr>
                   <pic:blipFill>
-                    <a:blip r:embed="rId22" cstate="print">
+                    <a:blip r:embed="rId20" cstate="print">
                       <a:extLst>
                         <a:ext uri="{28A0092B-C50C-407E-A947-70E740481C1C}">
                           <a14:useLocalDpi xmlns:a14="http://schemas.microsoft.com/office/drawing/2010/main" val="0"/>
@@ -3385,7 +3149,7 @@
                     <pic:cNvPicPr/>
                   </pic:nvPicPr>
                   <pic:blipFill>
-                    <a:blip r:embed="rId23" cstate="print">
+                    <a:blip r:embed="rId21" cstate="print">
                       <a:extLst>
                         <a:ext uri="{28A0092B-C50C-407E-A947-70E740481C1C}">
                           <a14:useLocalDpi xmlns:a14="http://schemas.microsoft.com/office/drawing/2010/main" val="0"/>
@@ -3445,7 +3209,7 @@
                     <pic:cNvPicPr/>
                   </pic:nvPicPr>
                   <pic:blipFill>
-                    <a:blip r:embed="rId24" cstate="print">
+                    <a:blip r:embed="rId22" cstate="print">
                       <a:extLst>
                         <a:ext uri="{28A0092B-C50C-407E-A947-70E740481C1C}">
                           <a14:useLocalDpi xmlns:a14="http://schemas.microsoft.com/office/drawing/2010/main" val="0"/>
@@ -3505,7 +3269,7 @@
                     <pic:cNvPicPr/>
                   </pic:nvPicPr>
                   <pic:blipFill>
-                    <a:blip r:embed="rId25" cstate="print">
+                    <a:blip r:embed="rId23" cstate="print">
                       <a:extLst>
                         <a:ext uri="{28A0092B-C50C-407E-A947-70E740481C1C}">
                           <a14:useLocalDpi xmlns:a14="http://schemas.microsoft.com/office/drawing/2010/main" val="0"/>
@@ -3565,7 +3329,7 @@
                     <pic:cNvPicPr/>
                   </pic:nvPicPr>
                   <pic:blipFill>
-                    <a:blip r:embed="rId26" cstate="print">
+                    <a:blip r:embed="rId24" cstate="print">
                       <a:extLst>
                         <a:ext uri="{28A0092B-C50C-407E-A947-70E740481C1C}">
                           <a14:useLocalDpi xmlns:a14="http://schemas.microsoft.com/office/drawing/2010/main" val="0"/>

</xml_diff>